<commit_message>
* support MQTT deployment and Debian 13 package validation
</commit_message>
<xml_diff>
--- a/docs/AIORS_PRE_RELEASE_TESTING_PROCEDURE.docx
+++ b/docs/AIORS_PRE_RELEASE_TESTING_PROCEDURE.docx
@@ -22,7 +22,7 @@
     </w:p>
     <w:p>
       <w:r>
-        <w:t>Document revision: 1.1 Last updated: 25 August 2026</w:t>
+        <w:t>Document revision: 1.2 Last updated: 13 September 2026</w:t>
       </w:r>
     </w:p>
     <w:p>
@@ -64,7 +64,7 @@
         <w:pStyle w:val="ListBullet"/>
       </w:pPr>
       <w:r>
-        <w:t>Raspberry Pi account: cro</w:t>
+        <w:t>Raspberry Pi account: aiors</w:t>
       </w:r>
     </w:p>
     <w:p>
@@ -148,12 +148,12 @@
           <w:rFonts w:ascii="Consolas" w:hAnsi="Consolas"/>
           <w:sz w:val="17"/>
         </w:rPr>
-        <w:t>cro@cro:~ $      Bash shell on the Raspberry Pi</w:t>
-      </w:r>
-    </w:p>
-    <w:p>
-      <w:r>
-        <w:t>Commands containing Windows paths such as .\dist\... must run in Windows PowerShell. Commands containing Linux paths such as /home/cro/... run on the Pi. Do not type the PowerShell scp upload command at a cro@cro:~ $ prompt. If you are connected to the Pi when a Windows command is required, run exit first to return to Windows PowerShell.</w:t>
+        <w:t>aiors@aiors:~ $      Bash shell on the Raspberry Pi</w:t>
+      </w:r>
+    </w:p>
+    <w:p>
+      <w:r>
+        <w:t>Commands containing Windows paths such as .\dist\... must run in Windows PowerShell. Commands containing Linux paths such as /home/aiors/... run on the Pi. Do not type the PowerShell scp upload command at an aiors@aiors:~ $ prompt. If you are connected to the Pi when a Windows command is required, run exit first to return to Windows PowerShell.</w:t>
       </w:r>
     </w:p>
     <w:p>
@@ -621,7 +621,7 @@
     </w:p>
     <w:p>
       <w:r>
-        <w:t>Run the upload commands in this section on the Windows PC in PowerShell (PS C:\...&gt;). If your prompt currently reads cro@cro:~ $, run exit before continuing.</w:t>
+        <w:t>Run the upload commands in this section on the Windows PC in PowerShell (PS C:\...&gt;). If your prompt currently reads aiors@aiors:~ $, run exit before continuing.</w:t>
       </w:r>
     </w:p>
     <w:p>
@@ -687,7 +687,7 @@
           <w:rFonts w:ascii="Consolas" w:hAnsi="Consolas"/>
           <w:sz w:val="17"/>
         </w:rPr>
-        <w:t>ssh cro@192.168.0.19 "uname -m; hostname"</w:t>
+        <w:t>ssh aiors@192.168.0.19 "uname -m; hostname"</w:t>
       </w:r>
     </w:p>
     <w:p>
@@ -714,7 +714,7 @@
           <w:rFonts w:ascii="Consolas" w:hAnsi="Consolas"/>
           <w:sz w:val="17"/>
         </w:rPr>
-        <w:t>ssh cro@192.168.0.19 "mkdir -p /home/cro/aiors-test"</w:t>
+        <w:t>ssh aiors@192.168.0.19 "mkdir -p /home/aiors/aiors-test"</w:t>
       </w:r>
     </w:p>
     <w:p>
@@ -736,7 +736,7 @@
           <w:rFonts w:ascii="Consolas" w:hAnsi="Consolas"/>
           <w:sz w:val="17"/>
         </w:rPr>
-        <w:t>scp.exe -r "C:/Users/sound/Documents/GitHub/aiors_bsp/.git/aiors_deploy/dist/deploy-test-v1.0.2-1" cro@192.168.0.19:/home/cro/aiors-test/</w:t>
+        <w:t>scp.exe -r "C:/Users/sound/Documents/GitHub/aiors_bsp/.git/aiors_deploy/dist/deploy-test-v1.0.2-1" aiors@192.168.0.19:/home/aiors/aiors-test/</w:t>
       </w:r>
     </w:p>
     <w:p>
@@ -758,7 +758,7 @@
           <w:rFonts w:ascii="Consolas" w:hAnsi="Consolas"/>
           <w:sz w:val="17"/>
         </w:rPr>
-        <w:t>scp.exe "C:/Users/sound/Documents/GitHub/aiors_bsp/.git/aiors_deploy/install.sh" cro@192.168.0.19:/home/cro/aiors-test/install.sh</w:t>
+        <w:t>scp.exe "C:/Users/sound/Documents/GitHub/aiors_bsp/.git/aiors_deploy/install.sh" aiors@192.168.0.19:/home/aiors/aiors-test/install.sh</w:t>
       </w:r>
     </w:p>
     <w:p>
@@ -780,34 +780,34 @@
           <w:rFonts w:ascii="Consolas" w:hAnsi="Consolas"/>
           <w:sz w:val="17"/>
         </w:rPr>
-        <w:t>ssh cro@192.168.0.19</w:t>
-      </w:r>
-    </w:p>
-    <w:p>
-      <w:r>
-        <w:t>After connecting, the prompt changes to cro@cro:~ $.</w:t>
-      </w:r>
-    </w:p>
-    <w:p>
-      <w:r>
-        <w:t>Run on: Raspberry Pi (cro@cro:~ $). Verify the copied files:</w:t>
-      </w:r>
-    </w:p>
-    <w:p>
-      <w:pPr>
-        <w:spacing w:after="0"/>
-        <w:ind w:left="255" w:right="113"/>
-        <w:rPr>
-          <w:rFonts w:ascii="Consolas" w:hAnsi="Consolas"/>
-          <w:sz w:val="17"/>
-        </w:rPr>
-      </w:pPr>
-      <w:r>
-        <w:rPr>
-          <w:rFonts w:ascii="Consolas" w:hAnsi="Consolas"/>
-          <w:sz w:val="17"/>
-        </w:rPr>
-        <w:t>ls -lh /home/cro/aiors-test/deploy-test-v1.0.2-1</w:t>
+        <w:t>ssh aiors@192.168.0.19</w:t>
+      </w:r>
+    </w:p>
+    <w:p>
+      <w:r>
+        <w:t>After connecting, the prompt changes to aiors@aiors:~ $.</w:t>
+      </w:r>
+    </w:p>
+    <w:p>
+      <w:r>
+        <w:t>Run on: Raspberry Pi (aiors@aiors:~ $). Verify the copied files:</w:t>
+      </w:r>
+    </w:p>
+    <w:p>
+      <w:pPr>
+        <w:spacing w:after="0"/>
+        <w:ind w:left="255" w:right="113"/>
+        <w:rPr>
+          <w:rFonts w:ascii="Consolas" w:hAnsi="Consolas"/>
+          <w:sz w:val="17"/>
+        </w:rPr>
+      </w:pPr>
+      <w:r>
+        <w:rPr>
+          <w:rFonts w:ascii="Consolas" w:hAnsi="Consolas"/>
+          <w:sz w:val="17"/>
+        </w:rPr>
+        <w:t>ls -lh /home/aiors/aiors-test/deploy-test-v1.0.2-1</w:t>
       </w:r>
     </w:p>
     <w:p>
@@ -825,7 +825,7 @@
           <w:sz w:val="17"/>
         </w:rPr>
         <w:lastRenderedPageBreak/>
-        <w:t>ls -l /home/cro/aiors-test/install.sh</w:t>
+        <w:t>ls -l /home/aiors/aiors-test/install.sh</w:t>
       </w:r>
     </w:p>
     <w:p>
@@ -846,7 +846,7 @@
     </w:p>
     <w:p>
       <w:r>
-        <w:t>Run on: Raspberry Pi (cro@cro:~ $).</w:t>
+        <w:t>Run on: Raspberry Pi (aiors@aiors:~ $).</w:t>
       </w:r>
     </w:p>
     <w:p>
@@ -1181,7 +1181,7 @@
     </w:p>
     <w:p>
       <w:r>
-        <w:t>Run on: Raspberry Pi (cro@cro:~ $).</w:t>
+        <w:t>Run on: Raspberry Pi (aiors@aiors:~ $).</w:t>
       </w:r>
     </w:p>
     <w:p>
@@ -1203,7 +1203,7 @@
           <w:rFonts w:ascii="Consolas" w:hAnsi="Consolas"/>
           <w:sz w:val="17"/>
         </w:rPr>
-        <w:t>chmod +x /home/cro/aiors-test/install.sh</w:t>
+        <w:t>chmod +x /home/aiors/aiors-test/install.sh</w:t>
       </w:r>
     </w:p>
     <w:p>
@@ -1225,7 +1225,7 @@
           <w:rFonts w:ascii="Consolas" w:hAnsi="Consolas"/>
           <w:sz w:val="17"/>
         </w:rPr>
-        <w:t>DEPLOY_ASSET_DIR="/home/cro/aiors-test/deploy-test-v1.0.2-1" \</w:t>
+        <w:t>DEPLOY_ASSET_DIR="/home/aiors/aiors-test/deploy-test-v1.0.2-1" \</w:t>
       </w:r>
     </w:p>
     <w:p>
@@ -1293,24 +1293,24 @@
           <w:rFonts w:ascii="Consolas" w:hAnsi="Consolas"/>
           <w:sz w:val="17"/>
         </w:rPr>
-        <w:t xml:space="preserve">  bash "/home/cro/aiors-test/install.sh" 2&gt;&amp;1 | \</w:t>
-      </w:r>
-    </w:p>
-    <w:p>
-      <w:pPr>
-        <w:spacing w:after="0"/>
-        <w:ind w:left="255" w:right="113"/>
-        <w:rPr>
-          <w:rFonts w:ascii="Consolas" w:hAnsi="Consolas"/>
-          <w:sz w:val="17"/>
-        </w:rPr>
-      </w:pPr>
-      <w:r>
-        <w:rPr>
-          <w:rFonts w:ascii="Consolas" w:hAnsi="Consolas"/>
-          <w:sz w:val="17"/>
-        </w:rPr>
-        <w:t xml:space="preserve">  tee "/home/cro/aiors-test/deploy-test-v1.0.2-1-install.log"</w:t>
+        <w:t xml:space="preserve">  bash "/home/aiors/aiors-test/install.sh" 2&gt;&amp;1 | \</w:t>
+      </w:r>
+    </w:p>
+    <w:p>
+      <w:pPr>
+        <w:spacing w:after="0"/>
+        <w:ind w:left="255" w:right="113"/>
+        <w:rPr>
+          <w:rFonts w:ascii="Consolas" w:hAnsi="Consolas"/>
+          <w:sz w:val="17"/>
+        </w:rPr>
+      </w:pPr>
+      <w:r>
+        <w:rPr>
+          <w:rFonts w:ascii="Consolas" w:hAnsi="Consolas"/>
+          <w:sz w:val="17"/>
+        </w:rPr>
+        <w:t xml:space="preserve">  tee "/home/aiors/aiors-test/deploy-test-v1.0.2-1-install.log"</w:t>
       </w:r>
     </w:p>
     <w:p>
@@ -1392,7 +1392,7 @@
     </w:p>
     <w:p>
       <w:r>
-        <w:t>Run on: Raspberry Pi (cro@cro:~ $).</w:t>
+        <w:t>Run on: Raspberry Pi (aiors@aiors:~ $).</w:t>
       </w:r>
     </w:p>
     <w:p>
@@ -1437,7 +1437,7 @@
           <w:rFonts w:ascii="Consolas" w:hAnsi="Consolas"/>
           <w:sz w:val="17"/>
         </w:rPr>
-        <w:t>ssh cro@192.168.0.19</w:t>
+        <w:t>ssh aiors@192.168.0.19</w:t>
       </w:r>
     </w:p>
     <w:p>
@@ -1458,7 +1458,7 @@
     </w:p>
     <w:p>
       <w:r>
-        <w:t>Run on: Raspberry Pi (cro@cro:~ $).</w:t>
+        <w:t>Run on: Raspberry Pi (aiors@aiors:~ $).</w:t>
       </w:r>
     </w:p>
     <w:p>
@@ -1652,7 +1652,7 @@
     </w:p>
     <w:p>
       <w:r>
-        <w:t>Run on: Raspberry Pi (cro@cro:~ $).</w:t>
+        <w:t>Run on: Raspberry Pi (aiors@aiors:~ $).</w:t>
       </w:r>
     </w:p>
     <w:p>
@@ -1958,7 +1958,7 @@
     </w:p>
     <w:p>
       <w:r>
-        <w:t>Run on: Raspberry Pi (cro@cro:~ $).</w:t>
+        <w:t>Run on: Raspberry Pi (aiors@aiors:~ $).</w:t>
       </w:r>
     </w:p>
     <w:p>
@@ -2129,7 +2129,7 @@
     </w:p>
     <w:p>
       <w:r>
-        <w:t>Run on: Raspberry Pi (cro@cro:~ $).</w:t>
+        <w:t>Run on: Raspberry Pi (aiors@aiors:~ $).</w:t>
       </w:r>
     </w:p>
     <w:p>
@@ -2228,7 +2228,7 @@
     </w:p>
     <w:p>
       <w:r>
-        <w:t>Run on: Raspberry Pi (cro@cro:~ $).</w:t>
+        <w:t>Run on: Raspberry Pi (aiors@aiors:~ $).</w:t>
       </w:r>
     </w:p>
     <w:p>
@@ -2478,7 +2478,7 @@
     </w:p>
     <w:p>
       <w:r>
-        <w:t>Run on: Raspberry Pi (cro@cro:~ $).</w:t>
+        <w:t>Run on: Raspberry Pi (aiors@aiors:~ $).</w:t>
       </w:r>
     </w:p>
     <w:p>
@@ -2600,7 +2600,7 @@
     </w:p>
     <w:p>
       <w:r>
-        <w:t>Run on: Raspberry Pi (cro@cro:~ $).</w:t>
+        <w:t>Run on: Raspberry Pi (aiors@aiors:~ $).</w:t>
       </w:r>
     </w:p>
     <w:p>
@@ -2661,7 +2661,7 @@
           <w:rFonts w:ascii="Consolas" w:hAnsi="Consolas"/>
           <w:sz w:val="17"/>
         </w:rPr>
-        <w:t>mkdir -p "/home/cro/aiors-test/results/deploy-test-v1.0.2-1"</w:t>
+        <w:t>mkdir -p "/home/aiors/aiors-test/results/deploy-test-v1.0.2-1"</w:t>
       </w:r>
     </w:p>
     <w:p>
@@ -2695,7 +2695,7 @@
           <w:rFonts w:ascii="Consolas" w:hAnsi="Consolas"/>
           <w:sz w:val="17"/>
         </w:rPr>
-        <w:t xml:space="preserve">  &gt; "/home/cro/aiors-test/results/deploy-test-v1.0.2-1/service-status.txt"</w:t>
+        <w:t xml:space="preserve">  &gt; "/home/aiors/aiors-test/results/deploy-test-v1.0.2-1/service-status.txt"</w:t>
       </w:r>
     </w:p>
     <w:p>
@@ -2729,7 +2729,7 @@
           <w:rFonts w:ascii="Consolas" w:hAnsi="Consolas"/>
           <w:sz w:val="17"/>
         </w:rPr>
-        <w:t xml:space="preserve">  &gt; "/home/cro/aiors-test/results/deploy-test-v1.0.2-1/radio-services-journal.txt"</w:t>
+        <w:t xml:space="preserve">  &gt; "/home/aiors/aiors-test/results/deploy-test-v1.0.2-1/radio-services-journal.txt"</w:t>
       </w:r>
     </w:p>
     <w:p>
@@ -2763,7 +2763,7 @@
           <w:rFonts w:ascii="Consolas" w:hAnsi="Consolas"/>
           <w:sz w:val="17"/>
         </w:rPr>
-        <w:t xml:space="preserve">  "/home/cro/aiors-test/results/deploy-test-v1.0.2-1/svxlink.log"</w:t>
+        <w:t xml:space="preserve">  "/home/aiors/aiors-test/results/deploy-test-v1.0.2-1/svxlink.log"</w:t>
       </w:r>
     </w:p>
     <w:p>
@@ -2797,24 +2797,24 @@
           <w:rFonts w:ascii="Consolas" w:hAnsi="Consolas"/>
           <w:sz w:val="17"/>
         </w:rPr>
-        <w:t xml:space="preserve">  "/home/cro/aiors-test/results/deploy-test-v1.0.2-1/svxstats_snapshot.txt"</w:t>
-      </w:r>
-    </w:p>
-    <w:p>
-      <w:pPr>
-        <w:spacing w:after="0"/>
-        <w:ind w:left="255" w:right="113"/>
-        <w:rPr>
-          <w:rFonts w:ascii="Consolas" w:hAnsi="Consolas"/>
-          <w:sz w:val="17"/>
-        </w:rPr>
-      </w:pPr>
-      <w:r>
-        <w:rPr>
-          <w:rFonts w:ascii="Consolas" w:hAnsi="Consolas"/>
-          <w:sz w:val="17"/>
-        </w:rPr>
-        <w:t>sudo chown -R cro:cro "/home/cro/aiors-test/results/deploy-test-v1.0.2-1"</w:t>
+        <w:t xml:space="preserve">  "/home/aiors/aiors-test/results/deploy-test-v1.0.2-1/svxstats_snapshot.txt"</w:t>
+      </w:r>
+    </w:p>
+    <w:p>
+      <w:pPr>
+        <w:spacing w:after="0"/>
+        <w:ind w:left="255" w:right="113"/>
+        <w:rPr>
+          <w:rFonts w:ascii="Consolas" w:hAnsi="Consolas"/>
+          <w:sz w:val="17"/>
+        </w:rPr>
+      </w:pPr>
+      <w:r>
+        <w:rPr>
+          <w:rFonts w:ascii="Consolas" w:hAnsi="Consolas"/>
+          <w:sz w:val="17"/>
+        </w:rPr>
+        <w:t>sudo chown -R aiors:aiors "/home/aiors/aiors-test/results/deploy-test-v1.0.2-1"</w:t>
       </w:r>
     </w:p>
     <w:p>
@@ -2835,7 +2835,7 @@
     </w:p>
     <w:p>
       <w:r>
-        <w:t>Run on: Raspberry Pi (cro@cro:~ $) using local console access.</w:t>
+        <w:t>Run on: Raspberry Pi (aiors@aiors:~ $) using local console access.</w:t>
       </w:r>
     </w:p>
     <w:p>
@@ -3220,7 +3220,7 @@
     </w:p>
     <w:p>
       <w:r>
-        <w:t>Run these checks on: Raspberry Pi (cro@cro:~ $).</w:t>
+        <w:t>Run these checks on: Raspberry Pi (aiors@aiors:~ $).</w:t>
       </w:r>
     </w:p>
     <w:p>

</xml_diff>